<commit_message>
add web application ITM outline
</commit_message>
<xml_diff>
--- a/Morning/AI/project/proposal template.docx
+++ b/Morning/AI/project/proposal template.docx
@@ -1,6 +1,6 @@
 
 <file path=word/document.xml><?xml version="1.0" encoding="utf-8"?>
-<w:document xmlns:wpc="http://schemas.microsoft.com/office/word/2010/wordprocessingCanvas" xmlns:mc="http://schemas.openxmlformats.org/markup-compatibility/2006" xmlns:o="urn:schemas-microsoft-com:office:office" xmlns:r="http://schemas.openxmlformats.org/officeDocument/2006/relationships" xmlns:m="http://schemas.openxmlformats.org/officeDocument/2006/math" xmlns:v="urn:schemas-microsoft-com:vml" xmlns:wp14="http://schemas.microsoft.com/office/word/2010/wordprocessingDrawing" xmlns:wp="http://schemas.openxmlformats.org/drawingml/2006/wordprocessingDrawing" xmlns:w10="urn:schemas-microsoft-com:office:word" xmlns:w="http://schemas.openxmlformats.org/wordprocessingml/2006/main" xmlns:w14="http://schemas.microsoft.com/office/word/2010/wordml" xmlns:w15="http://schemas.microsoft.com/office/word/2012/wordml" xmlns:wpg="http://schemas.microsoft.com/office/word/2010/wordprocessingGroup" xmlns:wpi="http://schemas.microsoft.com/office/word/2010/wordprocessingInk" xmlns:wne="http://schemas.microsoft.com/office/word/2006/wordml" xmlns:wps="http://schemas.microsoft.com/office/word/2010/wordprocessingShape" mc:Ignorable="w14 w15 wp14">
+<w:document xmlns:wpc="http://schemas.microsoft.com/office/word/2010/wordprocessingCanvas" xmlns:cx="http://schemas.microsoft.com/office/drawing/2014/chartex" xmlns:mc="http://schemas.openxmlformats.org/markup-compatibility/2006" xmlns:o="urn:schemas-microsoft-com:office:office" xmlns:r="http://schemas.openxmlformats.org/officeDocument/2006/relationships" xmlns:m="http://schemas.openxmlformats.org/officeDocument/2006/math" xmlns:v="urn:schemas-microsoft-com:vml" xmlns:wp14="http://schemas.microsoft.com/office/word/2010/wordprocessingDrawing" xmlns:wp="http://schemas.openxmlformats.org/drawingml/2006/wordprocessingDrawing" xmlns:w10="urn:schemas-microsoft-com:office:word" xmlns:w="http://schemas.openxmlformats.org/wordprocessingml/2006/main" xmlns:w14="http://schemas.microsoft.com/office/word/2010/wordml" xmlns:w15="http://schemas.microsoft.com/office/word/2012/wordml" xmlns:w16se="http://schemas.microsoft.com/office/word/2015/wordml/symex" xmlns:wpg="http://schemas.microsoft.com/office/word/2010/wordprocessingGroup" xmlns:wpi="http://schemas.microsoft.com/office/word/2010/wordprocessingInk" xmlns:wne="http://schemas.microsoft.com/office/word/2006/wordml" xmlns:wps="http://schemas.microsoft.com/office/word/2010/wordprocessingShape" mc:Ignorable="w14 w15 w16se wp14">
   <w:body>
     <w:p>
       <w:pPr>
@@ -489,6 +489,8 @@
                 <w:rFonts w:asciiTheme="majorBidi" w:hAnsiTheme="majorBidi" w:cstheme="majorBidi"/>
               </w:rPr>
             </w:pPr>
+            <w:bookmarkStart w:id="0" w:name="_GoBack"/>
+            <w:bookmarkEnd w:id="0"/>
           </w:p>
         </w:tc>
       </w:tr>
@@ -1821,16 +1823,16 @@
           <w:rFonts w:asciiTheme="majorBidi" w:hAnsiTheme="majorBidi" w:cstheme="majorBidi"/>
         </w:rPr>
       </w:pPr>
-      <w:bookmarkStart w:id="0" w:name="_Toc152587727"/>
-      <w:bookmarkStart w:id="1" w:name="_Toc152588267"/>
+      <w:bookmarkStart w:id="1" w:name="_Toc152587727"/>
+      <w:bookmarkStart w:id="2" w:name="_Toc152588267"/>
       <w:r>
         <w:rPr>
           <w:rFonts w:asciiTheme="majorBidi" w:hAnsiTheme="majorBidi" w:cstheme="majorBidi"/>
         </w:rPr>
         <w:t>Introduction</w:t>
       </w:r>
-      <w:bookmarkEnd w:id="0"/>
       <w:bookmarkEnd w:id="1"/>
+      <w:bookmarkEnd w:id="2"/>
     </w:p>
     <w:p>
       <w:pPr>
@@ -1861,16 +1863,16 @@
           <w:rFonts w:asciiTheme="majorBidi" w:hAnsiTheme="majorBidi" w:cstheme="majorBidi"/>
         </w:rPr>
       </w:pPr>
-      <w:bookmarkStart w:id="2" w:name="_Toc152587728"/>
-      <w:bookmarkStart w:id="3" w:name="_Toc152588268"/>
+      <w:bookmarkStart w:id="3" w:name="_Toc152587728"/>
+      <w:bookmarkStart w:id="4" w:name="_Toc152588268"/>
       <w:r>
         <w:rPr>
           <w:rFonts w:asciiTheme="majorBidi" w:hAnsiTheme="majorBidi" w:cstheme="majorBidi"/>
         </w:rPr>
         <w:t>Objective</w:t>
       </w:r>
-      <w:bookmarkEnd w:id="2"/>
       <w:bookmarkEnd w:id="3"/>
+      <w:bookmarkEnd w:id="4"/>
     </w:p>
     <w:p>
       <w:pPr>
@@ -1917,16 +1919,16 @@
           <w:rFonts w:asciiTheme="majorBidi" w:hAnsiTheme="majorBidi" w:cstheme="majorBidi"/>
         </w:rPr>
       </w:pPr>
-      <w:bookmarkStart w:id="4" w:name="_Toc152587731"/>
-      <w:bookmarkStart w:id="5" w:name="_Toc152588271"/>
+      <w:bookmarkStart w:id="5" w:name="_Toc152587731"/>
+      <w:bookmarkStart w:id="6" w:name="_Toc152588271"/>
       <w:r>
         <w:rPr>
           <w:rFonts w:asciiTheme="majorBidi" w:hAnsiTheme="majorBidi" w:cstheme="majorBidi"/>
         </w:rPr>
         <w:t>Project Scope</w:t>
       </w:r>
-      <w:bookmarkEnd w:id="4"/>
       <w:bookmarkEnd w:id="5"/>
+      <w:bookmarkEnd w:id="6"/>
     </w:p>
     <w:p>
       <w:pPr>
@@ -2014,8 +2016,6 @@
         </w:rPr>
         <w:t xml:space="preserve"> lines. </w:t>
       </w:r>
-      <w:bookmarkStart w:id="6" w:name="_GoBack"/>
-      <w:bookmarkEnd w:id="6"/>
     </w:p>
     <w:sectPr>
       <w:pgSz w:w="12240" w:h="15840"/>
@@ -2028,7 +2028,7 @@
 </file>
 
 <file path=word/endnotes.xml><?xml version="1.0" encoding="utf-8"?>
-<w:endnotes xmlns:wpc="http://schemas.microsoft.com/office/word/2010/wordprocessingCanvas" xmlns:mc="http://schemas.openxmlformats.org/markup-compatibility/2006" xmlns:o="urn:schemas-microsoft-com:office:office" xmlns:r="http://schemas.openxmlformats.org/officeDocument/2006/relationships" xmlns:m="http://schemas.openxmlformats.org/officeDocument/2006/math" xmlns:v="urn:schemas-microsoft-com:vml" xmlns:wp14="http://schemas.microsoft.com/office/word/2010/wordprocessingDrawing" xmlns:wp="http://schemas.openxmlformats.org/drawingml/2006/wordprocessingDrawing" xmlns:w10="urn:schemas-microsoft-com:office:word" xmlns:w="http://schemas.openxmlformats.org/wordprocessingml/2006/main" xmlns:w14="http://schemas.microsoft.com/office/word/2010/wordml" xmlns:w15="http://schemas.microsoft.com/office/word/2012/wordml" xmlns:wpg="http://schemas.microsoft.com/office/word/2010/wordprocessingGroup" xmlns:wpi="http://schemas.microsoft.com/office/word/2010/wordprocessingInk" xmlns:wne="http://schemas.microsoft.com/office/word/2006/wordml" xmlns:wps="http://schemas.microsoft.com/office/word/2010/wordprocessingShape" mc:Ignorable="w14 w15 wp14">
+<w:endnotes xmlns:wpc="http://schemas.microsoft.com/office/word/2010/wordprocessingCanvas" xmlns:cx="http://schemas.microsoft.com/office/drawing/2014/chartex" xmlns:mc="http://schemas.openxmlformats.org/markup-compatibility/2006" xmlns:o="urn:schemas-microsoft-com:office:office" xmlns:r="http://schemas.openxmlformats.org/officeDocument/2006/relationships" xmlns:m="http://schemas.openxmlformats.org/officeDocument/2006/math" xmlns:v="urn:schemas-microsoft-com:vml" xmlns:wp14="http://schemas.microsoft.com/office/word/2010/wordprocessingDrawing" xmlns:wp="http://schemas.openxmlformats.org/drawingml/2006/wordprocessingDrawing" xmlns:w10="urn:schemas-microsoft-com:office:word" xmlns:w="http://schemas.openxmlformats.org/wordprocessingml/2006/main" xmlns:w14="http://schemas.microsoft.com/office/word/2010/wordml" xmlns:w15="http://schemas.microsoft.com/office/word/2012/wordml" xmlns:w16se="http://schemas.microsoft.com/office/word/2015/wordml/symex" xmlns:wpg="http://schemas.microsoft.com/office/word/2010/wordprocessingGroup" xmlns:wpi="http://schemas.microsoft.com/office/word/2010/wordprocessingInk" xmlns:wne="http://schemas.microsoft.com/office/word/2006/wordml" xmlns:wps="http://schemas.microsoft.com/office/word/2010/wordprocessingShape" mc:Ignorable="w14 w15 w16se wp14">
   <w:endnote w:type="separator" w:id="-1">
     <w:p>
       <w:r>
@@ -2047,7 +2047,7 @@
 </file>
 
 <file path=word/footnotes.xml><?xml version="1.0" encoding="utf-8"?>
-<w:footnotes xmlns:wpc="http://schemas.microsoft.com/office/word/2010/wordprocessingCanvas" xmlns:mc="http://schemas.openxmlformats.org/markup-compatibility/2006" xmlns:o="urn:schemas-microsoft-com:office:office" xmlns:r="http://schemas.openxmlformats.org/officeDocument/2006/relationships" xmlns:m="http://schemas.openxmlformats.org/officeDocument/2006/math" xmlns:v="urn:schemas-microsoft-com:vml" xmlns:wp14="http://schemas.microsoft.com/office/word/2010/wordprocessingDrawing" xmlns:wp="http://schemas.openxmlformats.org/drawingml/2006/wordprocessingDrawing" xmlns:w10="urn:schemas-microsoft-com:office:word" xmlns:w="http://schemas.openxmlformats.org/wordprocessingml/2006/main" xmlns:w14="http://schemas.microsoft.com/office/word/2010/wordml" xmlns:w15="http://schemas.microsoft.com/office/word/2012/wordml" xmlns:wpg="http://schemas.microsoft.com/office/word/2010/wordprocessingGroup" xmlns:wpi="http://schemas.microsoft.com/office/word/2010/wordprocessingInk" xmlns:wne="http://schemas.microsoft.com/office/word/2006/wordml" xmlns:wps="http://schemas.microsoft.com/office/word/2010/wordprocessingShape" mc:Ignorable="w14 w15 wp14">
+<w:footnotes xmlns:wpc="http://schemas.microsoft.com/office/word/2010/wordprocessingCanvas" xmlns:cx="http://schemas.microsoft.com/office/drawing/2014/chartex" xmlns:mc="http://schemas.openxmlformats.org/markup-compatibility/2006" xmlns:o="urn:schemas-microsoft-com:office:office" xmlns:r="http://schemas.openxmlformats.org/officeDocument/2006/relationships" xmlns:m="http://schemas.openxmlformats.org/officeDocument/2006/math" xmlns:v="urn:schemas-microsoft-com:vml" xmlns:wp14="http://schemas.microsoft.com/office/word/2010/wordprocessingDrawing" xmlns:wp="http://schemas.openxmlformats.org/drawingml/2006/wordprocessingDrawing" xmlns:w10="urn:schemas-microsoft-com:office:word" xmlns:w="http://schemas.openxmlformats.org/wordprocessingml/2006/main" xmlns:w14="http://schemas.microsoft.com/office/word/2010/wordml" xmlns:w15="http://schemas.microsoft.com/office/word/2012/wordml" xmlns:w16se="http://schemas.microsoft.com/office/word/2015/wordml/symex" xmlns:wpg="http://schemas.microsoft.com/office/word/2010/wordprocessingGroup" xmlns:wpi="http://schemas.microsoft.com/office/word/2010/wordprocessingInk" xmlns:wne="http://schemas.microsoft.com/office/word/2006/wordml" xmlns:wps="http://schemas.microsoft.com/office/word/2010/wordprocessingShape" mc:Ignorable="w14 w15 w16se wp14">
   <w:footnote w:type="separator" w:id="-1">
     <w:p>
       <w:r>
@@ -2066,7 +2066,7 @@
 </file>
 
 <file path=word/numbering.xml><?xml version="1.0" encoding="utf-8"?>
-<w:numbering xmlns:wpc="http://schemas.microsoft.com/office/word/2010/wordprocessingCanvas" xmlns:mc="http://schemas.openxmlformats.org/markup-compatibility/2006" xmlns:o="urn:schemas-microsoft-com:office:office" xmlns:r="http://schemas.openxmlformats.org/officeDocument/2006/relationships" xmlns:m="http://schemas.openxmlformats.org/officeDocument/2006/math" xmlns:v="urn:schemas-microsoft-com:vml" xmlns:wp14="http://schemas.microsoft.com/office/word/2010/wordprocessingDrawing" xmlns:wp="http://schemas.openxmlformats.org/drawingml/2006/wordprocessingDrawing" xmlns:w10="urn:schemas-microsoft-com:office:word" xmlns:w="http://schemas.openxmlformats.org/wordprocessingml/2006/main" xmlns:w14="http://schemas.microsoft.com/office/word/2010/wordml" xmlns:w15="http://schemas.microsoft.com/office/word/2012/wordml" xmlns:wpg="http://schemas.microsoft.com/office/word/2010/wordprocessingGroup" xmlns:wpi="http://schemas.microsoft.com/office/word/2010/wordprocessingInk" xmlns:wne="http://schemas.microsoft.com/office/word/2006/wordml" xmlns:wps="http://schemas.microsoft.com/office/word/2010/wordprocessingShape" mc:Ignorable="w14 w15 wp14">
+<w:numbering xmlns:wpc="http://schemas.microsoft.com/office/word/2010/wordprocessingCanvas" xmlns:cx="http://schemas.microsoft.com/office/drawing/2014/chartex" xmlns:mc="http://schemas.openxmlformats.org/markup-compatibility/2006" xmlns:o="urn:schemas-microsoft-com:office:office" xmlns:r="http://schemas.openxmlformats.org/officeDocument/2006/relationships" xmlns:m="http://schemas.openxmlformats.org/officeDocument/2006/math" xmlns:v="urn:schemas-microsoft-com:vml" xmlns:wp14="http://schemas.microsoft.com/office/word/2010/wordprocessingDrawing" xmlns:wp="http://schemas.openxmlformats.org/drawingml/2006/wordprocessingDrawing" xmlns:w10="urn:schemas-microsoft-com:office:word" xmlns:w="http://schemas.openxmlformats.org/wordprocessingml/2006/main" xmlns:w14="http://schemas.microsoft.com/office/word/2010/wordml" xmlns:w15="http://schemas.microsoft.com/office/word/2012/wordml" xmlns:w16se="http://schemas.microsoft.com/office/word/2015/wordml/symex" xmlns:wpg="http://schemas.microsoft.com/office/word/2010/wordprocessingGroup" xmlns:wpi="http://schemas.microsoft.com/office/word/2010/wordprocessingInk" xmlns:wne="http://schemas.microsoft.com/office/word/2006/wordml" xmlns:wps="http://schemas.microsoft.com/office/word/2010/wordprocessingShape" mc:Ignorable="w14 w15 w16se wp14">
   <w:abstractNum w:abstractNumId="0" w15:restartNumberingAfterBreak="0">
     <w:nsid w:val="51696A78"/>
     <w:multiLevelType w:val="multilevel"/>
@@ -2276,7 +2276,7 @@
 </file>
 
 <file path=word/styles.xml><?xml version="1.0" encoding="utf-8"?>
-<w:styles xmlns:mc="http://schemas.openxmlformats.org/markup-compatibility/2006" xmlns:r="http://schemas.openxmlformats.org/officeDocument/2006/relationships" xmlns:w="http://schemas.openxmlformats.org/wordprocessingml/2006/main" xmlns:w14="http://schemas.microsoft.com/office/word/2010/wordml" xmlns:w15="http://schemas.microsoft.com/office/word/2012/wordml" mc:Ignorable="w14 w15">
+<w:styles xmlns:mc="http://schemas.openxmlformats.org/markup-compatibility/2006" xmlns:r="http://schemas.openxmlformats.org/officeDocument/2006/relationships" xmlns:w="http://schemas.openxmlformats.org/wordprocessingml/2006/main" xmlns:w14="http://schemas.microsoft.com/office/word/2010/wordml" xmlns:w15="http://schemas.microsoft.com/office/word/2012/wordml" xmlns:w16se="http://schemas.microsoft.com/office/word/2015/wordml/symex" mc:Ignorable="w14 w15 w16se">
   <w:docDefaults>
     <w:rPrDefault>
       <w:rPr>

</xml_diff>